<commit_message>
Créneaux de RDV : lendemain / surlendemain au lieu de jours fixes
On cale le rendez-vous tant que le prospect est chaud, plutôt que de
proposer des créneaux fixes en milieu de semaine suivante.

- Closing : « demain matin, ou jeudi après-midi ? »
- Grille des créneaux selon le jour d'appel (lundi à vendredi)
- Fin de semaine : bascule sur mardi, le surlendemain tombant sur le WE
- Règle : jamais plus de 4 jours ouvrés entre l'appel et le RDV
- Répercuté sur l'objection 1, l'objection 6, la relance de l'objection 10
  et l'anti-sèche, dans les versions HTML et Word

Co-Authored-By: Claude Opus 5 <noreply@anthropic.com>
Claude-Session: https://claude.ai/code/session_01HDCNPBWmfdNsWcsF2ubqP6
</commit_message>
<xml_diff>
--- a/02-Prospection/SCRIPT-TELEPHONE-IT-parle.docx
+++ b/02-Prospection/SCRIPT-TELEPHONE-IT-parle.docx
@@ -2017,7 +2017,7 @@
           <w:sz w:val="22"/>
           <w:szCs w:val="22"/>
         </w:rPr>
-        <w:t xml:space="preserve">Vous êtes plutôt mardi matin, ou mercredi après-midi ?</w:t>
+        <w:t xml:space="preserve">Vous êtes plutôt demain matin, ou jeudi après-midi ?</w:t>
       </w:r>
     </w:p>
     <w:p>
@@ -2078,7 +2078,7 @@
           <w:sz w:val="20"/>
           <w:szCs w:val="20"/>
         </w:rPr>
-        <w:t xml:space="preserve">« Mardi, plutôt. »</w:t>
+        <w:t xml:space="preserve">« Demain, plutôt. »</w:t>
       </w:r>
     </w:p>
     <w:p>
@@ -2148,6 +2148,399 @@
           <w:szCs w:val="18"/>
         </w:rPr>
         <w:t xml:space="preserve">( Tu verrouilles le mail dans la foulée, tant qu'il est encore d'accord. Un RDV sans invitation envoyée n'existe pas. )</w:t>
+      </w:r>
+    </w:p>
+    <w:p>
+      <w:pPr>
+        <w:pBdr>
+          <w:top w:val="single" w:color="4E6350" w:sz="4" w:space="6"/>
+          <w:bottom w:val="single" w:color="4E6350" w:sz="4" w:space="6"/>
+          <w:left w:val="single" w:color="4E6350" w:sz="4" w:space="8"/>
+          <w:right w:val="single" w:color="4E6350" w:sz="4" w:space="8"/>
+        </w:pBdr>
+        <w:shd w:fill="EAEFEA" w:color="auto" w:val="clear"/>
+        <w:spacing w:after="140" w:before="140"/>
+        <w:ind w:left="1200"/>
+      </w:pPr>
+      <w:r>
+        <w:rPr>
+          <w:rFonts w:ascii="Segoe UI" w:cs="Segoe UI" w:eastAsia="Segoe UI" w:hAnsi="Segoe UI"/>
+          <w:b/>
+          <w:bCs/>
+          <w:color w:val="4E6350"/>
+          <w:sz w:val="17"/>
+          <w:szCs w:val="17"/>
+        </w:rPr>
+        <w:t xml:space="preserve">V  SURFE SUR LA VAGUE : LENDEMAIN OU SURLENDEMAIN</w:t>
+      </w:r>
+      <w:r>
+        <w:br/>
+        <w:t xml:space="preserve"/>
+      </w:r>
+      <w:r>
+        <w:rPr>
+          <w:rFonts w:ascii="Segoe UI" w:cs="Segoe UI" w:eastAsia="Segoe UI" w:hAnsi="Segoe UI"/>
+          <w:color w:val="4E6350"/>
+          <w:sz w:val="19"/>
+          <w:szCs w:val="19"/>
+        </w:rPr>
+        <w:t xml:space="preserve">Il vient de te dire son problème, il est chaud maintenant. Chaque jour d'attente fait retomber la pression — et grimper le no-show. Tu proposes toujours les deux prochains jours ouvrés, jamais « la semaine prochaine ».</w:t>
+      </w:r>
+    </w:p>
+    <w:tbl>
+      <w:tblPr>
+        <w:tblW w:type="dxa" w:w="8700"/>
+        <w:tblInd w:type="dxa" w:w="1200"/>
+        <w:tblBorders>
+          <w:top w:val="single" w:color="auto" w:sz="4"/>
+          <w:left w:val="single" w:color="auto" w:sz="4"/>
+          <w:bottom w:val="single" w:color="auto" w:sz="4"/>
+          <w:right w:val="single" w:color="auto" w:sz="4"/>
+          <w:insideH w:val="single" w:color="auto" w:sz="4"/>
+          <w:insideV w:val="single" w:color="auto" w:sz="4"/>
+        </w:tblBorders>
+      </w:tblPr>
+      <w:tblGrid>
+        <w:gridCol w:w="2500"/>
+        <w:gridCol w:w="6200"/>
+      </w:tblGrid>
+      <w:tr>
+        <w:trPr>
+          <w:tblHeader/>
+        </w:trPr>
+        <w:tc>
+          <w:tcPr>
+            <w:tcW w:type="dxa" w:w="2500"/>
+            <w:shd w:fill="2E3B4E" w:color="auto" w:val="clear"/>
+            <w:tcMar>
+              <w:top w:type="dxa" w:w="80"/>
+              <w:left w:type="dxa" w:w="140"/>
+              <w:bottom w:type="dxa" w:w="80"/>
+              <w:right w:type="dxa" w:w="140"/>
+            </w:tcMar>
+          </w:tcPr>
+          <w:p>
+            <w:r>
+              <w:rPr>
+                <w:rFonts w:ascii="Segoe UI" w:cs="Segoe UI" w:eastAsia="Segoe UI" w:hAnsi="Segoe UI"/>
+                <w:b/>
+                <w:bCs/>
+                <w:color w:val="FFFFFF"/>
+                <w:sz w:val="16"/>
+                <w:szCs w:val="16"/>
+              </w:rPr>
+              <w:t xml:space="preserve">TU APPELLES UN…</w:t>
+            </w:r>
+          </w:p>
+        </w:tc>
+        <w:tc>
+          <w:tcPr>
+            <w:tcW w:type="dxa" w:w="6200"/>
+            <w:shd w:fill="2E3B4E" w:color="auto" w:val="clear"/>
+            <w:tcMar>
+              <w:top w:type="dxa" w:w="80"/>
+              <w:left w:type="dxa" w:w="140"/>
+              <w:bottom w:type="dxa" w:w="80"/>
+              <w:right w:type="dxa" w:w="140"/>
+            </w:tcMar>
+          </w:tcPr>
+          <w:p>
+            <w:r>
+              <w:rPr>
+                <w:rFonts w:ascii="Segoe UI" w:cs="Segoe UI" w:eastAsia="Segoe UI" w:hAnsi="Segoe UI"/>
+                <w:b/>
+                <w:bCs/>
+                <w:color w:val="FFFFFF"/>
+                <w:sz w:val="16"/>
+                <w:szCs w:val="16"/>
+              </w:rPr>
+              <w:t xml:space="preserve">TU PROPOSES</w:t>
+            </w:r>
+          </w:p>
+        </w:tc>
+      </w:tr>
+      <w:tr>
+        <w:tc>
+          <w:tcPr>
+            <w:tcW w:type="dxa" w:w="2500"/>
+            <w:tcMar>
+              <w:top w:type="dxa" w:w="80"/>
+              <w:left w:type="dxa" w:w="140"/>
+              <w:bottom w:type="dxa" w:w="80"/>
+              <w:right w:type="dxa" w:w="140"/>
+            </w:tcMar>
+          </w:tcPr>
+          <w:p>
+            <w:r>
+              <w:rPr>
+                <w:rFonts w:ascii="Segoe UI" w:cs="Segoe UI" w:eastAsia="Segoe UI" w:hAnsi="Segoe UI"/>
+                <w:b/>
+                <w:bCs/>
+                <w:caps w:val="false"/>
+                <w:color w:val="2E3B4E"/>
+                <w:sz w:val="19"/>
+                <w:szCs w:val="19"/>
+              </w:rPr>
+              <w:t xml:space="preserve">Lundi</w:t>
+            </w:r>
+          </w:p>
+        </w:tc>
+        <w:tc>
+          <w:tcPr>
+            <w:tcW w:type="dxa" w:w="6200"/>
+            <w:tcMar>
+              <w:top w:type="dxa" w:w="80"/>
+              <w:left w:type="dxa" w:w="140"/>
+              <w:bottom w:type="dxa" w:w="80"/>
+              <w:right w:type="dxa" w:w="140"/>
+            </w:tcMar>
+          </w:tcPr>
+          <w:p>
+            <w:r>
+              <w:rPr>
+                <w:rFonts w:ascii="Segoe UI" w:cs="Segoe UI" w:eastAsia="Segoe UI" w:hAnsi="Segoe UI"/>
+                <w:b w:val="false"/>
+                <w:bCs w:val="false"/>
+                <w:caps w:val="false"/>
+                <w:color w:val="4E6E8C"/>
+                <w:sz w:val="19"/>
+                <w:szCs w:val="19"/>
+              </w:rPr>
+              <w:t xml:space="preserve">demain matin, ou mercredi après-midi</w:t>
+            </w:r>
+          </w:p>
+        </w:tc>
+      </w:tr>
+      <w:tr>
+        <w:tc>
+          <w:tcPr>
+            <w:tcW w:type="dxa" w:w="2500"/>
+            <w:tcMar>
+              <w:top w:type="dxa" w:w="80"/>
+              <w:left w:type="dxa" w:w="140"/>
+              <w:bottom w:type="dxa" w:w="80"/>
+              <w:right w:type="dxa" w:w="140"/>
+            </w:tcMar>
+          </w:tcPr>
+          <w:p>
+            <w:r>
+              <w:rPr>
+                <w:rFonts w:ascii="Segoe UI" w:cs="Segoe UI" w:eastAsia="Segoe UI" w:hAnsi="Segoe UI"/>
+                <w:b/>
+                <w:bCs/>
+                <w:caps w:val="false"/>
+                <w:color w:val="2E3B4E"/>
+                <w:sz w:val="19"/>
+                <w:szCs w:val="19"/>
+              </w:rPr>
+              <w:t xml:space="preserve">Mardi</w:t>
+            </w:r>
+          </w:p>
+        </w:tc>
+        <w:tc>
+          <w:tcPr>
+            <w:tcW w:type="dxa" w:w="6200"/>
+            <w:tcMar>
+              <w:top w:type="dxa" w:w="80"/>
+              <w:left w:type="dxa" w:w="140"/>
+              <w:bottom w:type="dxa" w:w="80"/>
+              <w:right w:type="dxa" w:w="140"/>
+            </w:tcMar>
+          </w:tcPr>
+          <w:p>
+            <w:r>
+              <w:rPr>
+                <w:rFonts w:ascii="Segoe UI" w:cs="Segoe UI" w:eastAsia="Segoe UI" w:hAnsi="Segoe UI"/>
+                <w:b w:val="false"/>
+                <w:bCs w:val="false"/>
+                <w:caps w:val="false"/>
+                <w:color w:val="4E6E8C"/>
+                <w:sz w:val="19"/>
+                <w:szCs w:val="19"/>
+              </w:rPr>
+              <w:t xml:space="preserve">demain matin, ou jeudi après-midi</w:t>
+            </w:r>
+          </w:p>
+        </w:tc>
+      </w:tr>
+      <w:tr>
+        <w:tc>
+          <w:tcPr>
+            <w:tcW w:type="dxa" w:w="2500"/>
+            <w:tcMar>
+              <w:top w:type="dxa" w:w="80"/>
+              <w:left w:type="dxa" w:w="140"/>
+              <w:bottom w:type="dxa" w:w="80"/>
+              <w:right w:type="dxa" w:w="140"/>
+            </w:tcMar>
+          </w:tcPr>
+          <w:p>
+            <w:r>
+              <w:rPr>
+                <w:rFonts w:ascii="Segoe UI" w:cs="Segoe UI" w:eastAsia="Segoe UI" w:hAnsi="Segoe UI"/>
+                <w:b/>
+                <w:bCs/>
+                <w:caps w:val="false"/>
+                <w:color w:val="2E3B4E"/>
+                <w:sz w:val="19"/>
+                <w:szCs w:val="19"/>
+              </w:rPr>
+              <w:t xml:space="preserve">Mercredi</w:t>
+            </w:r>
+          </w:p>
+        </w:tc>
+        <w:tc>
+          <w:tcPr>
+            <w:tcW w:type="dxa" w:w="6200"/>
+            <w:tcMar>
+              <w:top w:type="dxa" w:w="80"/>
+              <w:left w:type="dxa" w:w="140"/>
+              <w:bottom w:type="dxa" w:w="80"/>
+              <w:right w:type="dxa" w:w="140"/>
+            </w:tcMar>
+          </w:tcPr>
+          <w:p>
+            <w:r>
+              <w:rPr>
+                <w:rFonts w:ascii="Segoe UI" w:cs="Segoe UI" w:eastAsia="Segoe UI" w:hAnsi="Segoe UI"/>
+                <w:b w:val="false"/>
+                <w:bCs w:val="false"/>
+                <w:caps w:val="false"/>
+                <w:color w:val="4E6E8C"/>
+                <w:sz w:val="19"/>
+                <w:szCs w:val="19"/>
+              </w:rPr>
+              <w:t xml:space="preserve">demain matin, ou vendredi après-midi</w:t>
+            </w:r>
+          </w:p>
+        </w:tc>
+      </w:tr>
+      <w:tr>
+        <w:tc>
+          <w:tcPr>
+            <w:tcW w:type="dxa" w:w="2500"/>
+            <w:shd w:fill="F5EEE0" w:color="auto" w:val="clear"/>
+            <w:tcMar>
+              <w:top w:type="dxa" w:w="80"/>
+              <w:left w:type="dxa" w:w="140"/>
+              <w:bottom w:type="dxa" w:w="80"/>
+              <w:right w:type="dxa" w:w="140"/>
+            </w:tcMar>
+          </w:tcPr>
+          <w:p>
+            <w:r>
+              <w:rPr>
+                <w:rFonts w:ascii="Segoe UI" w:cs="Segoe UI" w:eastAsia="Segoe UI" w:hAnsi="Segoe UI"/>
+                <w:b/>
+                <w:bCs/>
+                <w:caps w:val="false"/>
+                <w:color w:val="2E3B4E"/>
+                <w:sz w:val="19"/>
+                <w:szCs w:val="19"/>
+              </w:rPr>
+              <w:t xml:space="preserve">Jeudi</w:t>
+            </w:r>
+          </w:p>
+        </w:tc>
+        <w:tc>
+          <w:tcPr>
+            <w:tcW w:type="dxa" w:w="6200"/>
+            <w:shd w:fill="F5EEE0" w:color="auto" w:val="clear"/>
+            <w:tcMar>
+              <w:top w:type="dxa" w:w="80"/>
+              <w:left w:type="dxa" w:w="140"/>
+              <w:bottom w:type="dxa" w:w="80"/>
+              <w:right w:type="dxa" w:w="140"/>
+            </w:tcMar>
+          </w:tcPr>
+          <w:p>
+            <w:r>
+              <w:rPr>
+                <w:rFonts w:ascii="Segoe UI" w:cs="Segoe UI" w:eastAsia="Segoe UI" w:hAnsi="Segoe UI"/>
+                <w:b w:val="false"/>
+                <w:bCs w:val="false"/>
+                <w:caps w:val="false"/>
+                <w:color w:val="4E6E8C"/>
+                <w:sz w:val="19"/>
+                <w:szCs w:val="19"/>
+              </w:rPr>
+              <w:t xml:space="preserve">demain matin, ou mardi après-midi</w:t>
+            </w:r>
+          </w:p>
+        </w:tc>
+      </w:tr>
+      <w:tr>
+        <w:tc>
+          <w:tcPr>
+            <w:tcW w:type="dxa" w:w="2500"/>
+            <w:shd w:fill="F5EEE0" w:color="auto" w:val="clear"/>
+            <w:tcMar>
+              <w:top w:type="dxa" w:w="80"/>
+              <w:left w:type="dxa" w:w="140"/>
+              <w:bottom w:type="dxa" w:w="80"/>
+              <w:right w:type="dxa" w:w="140"/>
+            </w:tcMar>
+          </w:tcPr>
+          <w:p>
+            <w:r>
+              <w:rPr>
+                <w:rFonts w:ascii="Segoe UI" w:cs="Segoe UI" w:eastAsia="Segoe UI" w:hAnsi="Segoe UI"/>
+                <w:b/>
+                <w:bCs/>
+                <w:caps w:val="false"/>
+                <w:color w:val="2E3B4E"/>
+                <w:sz w:val="19"/>
+                <w:szCs w:val="19"/>
+              </w:rPr>
+              <w:t xml:space="preserve">Vendredi</w:t>
+            </w:r>
+          </w:p>
+        </w:tc>
+        <w:tc>
+          <w:tcPr>
+            <w:tcW w:type="dxa" w:w="6200"/>
+            <w:shd w:fill="F5EEE0" w:color="auto" w:val="clear"/>
+            <w:tcMar>
+              <w:top w:type="dxa" w:w="80"/>
+              <w:left w:type="dxa" w:w="140"/>
+              <w:bottom w:type="dxa" w:w="80"/>
+              <w:right w:type="dxa" w:w="140"/>
+            </w:tcMar>
+          </w:tcPr>
+          <w:p>
+            <w:r>
+              <w:rPr>
+                <w:rFonts w:ascii="Segoe UI" w:cs="Segoe UI" w:eastAsia="Segoe UI" w:hAnsi="Segoe UI"/>
+                <w:b w:val="false"/>
+                <w:bCs w:val="false"/>
+                <w:caps w:val="false"/>
+                <w:color w:val="4E6E8C"/>
+                <w:sz w:val="19"/>
+                <w:szCs w:val="19"/>
+              </w:rPr>
+              <w:t xml:space="preserve">lundi matin, ou mardi après-midi</w:t>
+            </w:r>
+          </w:p>
+        </w:tc>
+      </w:tr>
+    </w:tbl>
+    <w:p>
+      <w:pPr>
+        <w:spacing w:after="60" w:before="60"/>
+        <w:ind w:left="1200"/>
+      </w:pPr>
+      <w:r>
+        <w:rPr>
+          <w:rFonts w:ascii="Segoe UI" w:cs="Segoe UI" w:eastAsia="Segoe UI" w:hAnsi="Segoe UI"/>
+          <w:b w:val="false"/>
+          <w:bCs w:val="false"/>
+          <w:i w:val="false"/>
+          <w:iCs w:val="false"/>
+          <w:color w:val="7A736A"/>
+          <w:sz w:val="17"/>
+          <w:szCs w:val="17"/>
+        </w:rPr>
+        <w:t xml:space="preserve">En fin de semaine, le surlendemain tombe sur le week-end : tu bascules sur mardi. Jamais plus de 4 jours ouvrés entre l'appel et le rendez-vous.</w:t>
       </w:r>
     </w:p>
     <w:p>
@@ -2188,6 +2581,43 @@
       </w:r>
     </w:p>
     <w:p>
+      <w:pPr>
+        <w:pBdr>
+          <w:top w:val="single" w:color="B05C4A" w:sz="4" w:space="6"/>
+          <w:bottom w:val="single" w:color="B05C4A" w:sz="4" w:space="6"/>
+          <w:left w:val="single" w:color="B05C4A" w:sz="4" w:space="8"/>
+          <w:right w:val="single" w:color="B05C4A" w:sz="4" w:space="8"/>
+        </w:pBdr>
+        <w:shd w:fill="F7E9E5" w:color="auto" w:val="clear"/>
+        <w:spacing w:after="140" w:before="140"/>
+        <w:ind w:left="1200"/>
+      </w:pPr>
+      <w:r>
+        <w:rPr>
+          <w:rFonts w:ascii="Segoe UI" w:cs="Segoe UI" w:eastAsia="Segoe UI" w:hAnsi="Segoe UI"/>
+          <w:b/>
+          <w:bCs/>
+          <w:color w:val="B05C4A"/>
+          <w:sz w:val="17"/>
+          <w:szCs w:val="17"/>
+        </w:rPr>
+        <w:t xml:space="preserve">X  JAMAIS</w:t>
+      </w:r>
+      <w:r>
+        <w:br/>
+        <w:t xml:space="preserve"/>
+      </w:r>
+      <w:r>
+        <w:rPr>
+          <w:rFonts w:ascii="Segoe UI" w:cs="Segoe UI" w:eastAsia="Segoe UI" w:hAnsi="Segoe UI"/>
+          <w:color w:val="B05C4A"/>
+          <w:sz w:val="19"/>
+          <w:szCs w:val="19"/>
+        </w:rPr>
+        <w:t xml:space="preserve">« La semaine prochaine », « on se rappelle pour caler ». Une date, une heure, une invitation envoyée pendant l'appel — sinon le rendez-vous n'existe pas.</w:t>
+      </w:r>
+    </w:p>
+    <w:p>
       <w:r>
         <w:br w:type="page"/>
       </w:r>
@@ -2456,7 +2886,24 @@
           <w:sz w:val="22"/>
           <w:szCs w:val="22"/>
         </w:rPr>
-        <w:t xml:space="preserve">Mardi matin ou mercredi après-midi ?</w:t>
+        <w:t xml:space="preserve">Demain matin ou jeudi après-midi ?</w:t>
+      </w:r>
+    </w:p>
+    <w:p>
+      <w:pPr>
+        <w:spacing w:after="80" w:before="80"/>
+        <w:ind w:left="1200"/>
+      </w:pPr>
+      <w:r>
+        <w:rPr>
+          <w:rFonts w:ascii="Segoe UI" w:cs="Segoe UI" w:eastAsia="Segoe UI" w:hAnsi="Segoe UI"/>
+          <w:i/>
+          <w:iCs/>
+          <w:color w:val="8A7A9B"/>
+          <w:sz w:val="18"/>
+          <w:szCs w:val="18"/>
+        </w:rPr>
+        <w:t xml:space="preserve">( Adapte selon le jour où tu appelles — voir la grille des créneaux (étape 4). )</w:t>
       </w:r>
     </w:p>
     <w:p>
@@ -3695,7 +4142,7 @@
           <w:sz w:val="22"/>
           <w:szCs w:val="22"/>
         </w:rPr>
-        <w:t xml:space="preserve">Mardi ou mercredi ?</w:t>
+        <w:t xml:space="preserve">Demain ou jeudi ?</w:t>
       </w:r>
     </w:p>
     <w:p>
@@ -4513,7 +4960,7 @@
           <w:sz w:val="18"/>
           <w:szCs w:val="18"/>
         </w:rPr>
-        <w:t xml:space="preserve">Tu veux une date et une heure. « La semaine prochaine », c'est pas une date — relance : « plutôt lundi ou jeudi ? »</w:t>
+        <w:t xml:space="preserve">Tu veux une date et une heure. « La semaine prochaine », c'est pas une date — relance : « plutôt demain ou jeudi ? »</w:t>
       </w:r>
     </w:p>
     <w:p>
@@ -5079,7 +5526,44 @@
           <w:sz w:val="19"/>
           <w:szCs w:val="19"/>
         </w:rPr>
-        <w:t xml:space="preserve">« Juste par curiosité… »  ·  « Justement. »  ·  « Je comprends. »  ·  « C'est exactement pour ça que je vous appelle. »  ·  « Mardi matin ou mercredi après-midi ? »</w:t>
+        <w:t xml:space="preserve">« Juste par curiosité… »  ·  « Justement. »  ·  « Je comprends. »  ·  « C'est exactement pour ça que je vous appelle. »  ·  « Demain matin, ou jeudi après-midi ? »</w:t>
+      </w:r>
+    </w:p>
+    <w:p>
+      <w:pPr>
+        <w:pBdr>
+          <w:top w:val="single" w:color="4E6350" w:sz="4" w:space="6"/>
+          <w:bottom w:val="single" w:color="4E6350" w:sz="4" w:space="6"/>
+          <w:left w:val="single" w:color="4E6350" w:sz="4" w:space="8"/>
+          <w:right w:val="single" w:color="4E6350" w:sz="4" w:space="8"/>
+        </w:pBdr>
+        <w:shd w:fill="EAEFEA" w:color="auto" w:val="clear"/>
+        <w:spacing w:after="140" w:before="140"/>
+        <w:ind w:left="1200"/>
+      </w:pPr>
+      <w:r>
+        <w:rPr>
+          <w:rFonts w:ascii="Segoe UI" w:cs="Segoe UI" w:eastAsia="Segoe UI" w:hAnsi="Segoe UI"/>
+          <w:b/>
+          <w:bCs/>
+          <w:color w:val="4E6350"/>
+          <w:sz w:val="17"/>
+          <w:szCs w:val="17"/>
+        </w:rPr>
+        <w:t xml:space="preserve">V  LA RÈGLE DU CRÉNEAU</w:t>
+      </w:r>
+      <w:r>
+        <w:br/>
+        <w:t xml:space="preserve"/>
+      </w:r>
+      <w:r>
+        <w:rPr>
+          <w:rFonts w:ascii="Segoe UI" w:cs="Segoe UI" w:eastAsia="Segoe UI" w:hAnsi="Segoe UI"/>
+          <w:color w:val="4E6350"/>
+          <w:sz w:val="19"/>
+          <w:szCs w:val="19"/>
+        </w:rPr>
+        <w:t xml:space="preserve">Toujours lendemain ou surlendemain. En fin de semaine, bascule sur mardi. Jamais plus de 4 jours ouvrés — au-delà, le rendez-vous saute.</w:t>
       </w:r>
     </w:p>
     <w:p>

</xml_diff>